<commit_message>
Change default Docker port from 8080 to 8888.
Updates compose config, CORS origin, and all deployment documentation to match the port in use for demos and production handoff.

Co-authored-by: Cursor <cursoragent@cursor.com>
</commit_message>
<xml_diff>
--- a/docs/shareable/DPDP_Phase1_Project_Overview.docx
+++ b/docs/shareable/DPDP_Phase1_Project_Overview.docx
@@ -2263,7 +2263,7 @@
         <w:rPr>
           <w:rStyle w:val="VerbatimChar"/>
         </w:rPr>
-        <w:t xml:space="preserve">│  │ Port: 8080      │    │ Port: 8000       │  │</w:t>
+        <w:t xml:space="preserve">│  │ Port: 8888      │    │ Port: 8000       │  │</w:t>
       </w:r>
       <w:r>
         <w:br/>
@@ -4956,7 +4956,7 @@
         <w:t xml:space="preserve"> </w:t>
       </w:r>
       <w:r>
-        <w:t xml:space="preserve">— nginx serving the React app on port 8080</w:t>
+        <w:t xml:space="preserve">— nginx serving the React app on port 8888</w:t>
       </w:r>
       <w:r>
         <w:br/>

</xml_diff>